<commit_message>
Plan: the save request waits for a project, and saving is the gate
Records both of today's corrections and why, so neither is quietly undone later:
the request appears only once a project is open, and an armed move carries across
only those who have already saved.

Co-Authored-By: Claude Opus 5 <noreply@anthropic.com>
</commit_message>
<xml_diff>
--- a/KEYGUARD-MIGRATION-PLAN.docx
+++ b/KEYGUARD-MIGRATION-PLAN.docx
@@ -1251,6 +1251,64 @@
                 <w:sz w:val="21"/>
                 <w:szCs w:val="21"/>
               </w:rPr>
+              <w:t xml:space="preserve">⚠ Saving is the gate, and it has to be built that way. </w:t>
+            </w:r>
+            <w:r>
+              <w:rPr>
+                <w:rFonts w:ascii="Calibri" w:cs="Calibri" w:eastAsia="Calibri" w:hAnsi="Calibri"/>
+                <w:color w:val="1B2220"/>
+                <w:sz w:val="21"/>
+                <w:szCs w:val="21"/>
+              </w:rPr>
+              <w:t xml:space="preserve">An armed move carries across only those who have already saved a copy. Anyone who has not is asked first, and “Not now” genuinely means nothing happens — which is what the notice promises them. Built without that gate the move runs on every load once armed and takes people who have just declined; that is exactly what the first implementation did, and it was caught on the rig rather than by reading the code.</w:t>
+            </w:r>
+          </w:p>
+        </w:tc>
+      </w:tr>
+    </w:tbl>
+    <w:tbl>
+      <w:tblPr>
+        <w:tblW w:type="dxa" w:w="9360"/>
+        <w:tblBorders>
+          <w:top w:val="single" w:color="C9D4D0" w:sz="2"/>
+          <w:left w:val="single" w:color="C9D4D0" w:sz="2"/>
+          <w:bottom w:val="single" w:color="C9D4D0" w:sz="2"/>
+          <w:right w:val="single" w:color="C9D4D0" w:sz="2"/>
+          <w:insideH w:val="single" w:color="C9D4D0" w:sz="2"/>
+          <w:insideV w:val="single" w:color="C9D4D0" w:sz="2"/>
+        </w:tblBorders>
+      </w:tblPr>
+      <w:tblGrid>
+        <w:gridCol w:w="9360"/>
+      </w:tblGrid>
+      <w:tr>
+        <w:trPr>
+          <w:tblHeader w:val="false"/>
+        </w:trPr>
+        <w:tc>
+          <w:tcPr>
+            <w:tcW w:type="dxa" w:w="9360"/>
+            <w:shd w:fill="F4F7F6" w:color="auto" w:val="clear"/>
+            <w:tcMar>
+              <w:top w:type="dxa" w:w="90"/>
+              <w:left w:type="dxa" w:w="130"/>
+              <w:bottom w:type="dxa" w:w="90"/>
+              <w:right w:type="dxa" w:w="130"/>
+            </w:tcMar>
+          </w:tcPr>
+          <w:p>
+            <w:pPr>
+              <w:spacing w:after="0" w:before="0" w:line="276"/>
+            </w:pPr>
+            <w:r>
+              <w:rPr>
+                <w:rFonts w:ascii="Calibri" w:cs="Calibri" w:eastAsia="Calibri" w:hAnsi="Calibri"/>
+                <w:b/>
+                <w:bCs/>
+                <w:color w:val="1B2220"/>
+                <w:sz w:val="21"/>
+                <w:szCs w:val="21"/>
+              </w:rPr>
               <w:t xml:space="preserve">Someone who has already saved, once the move is armed, sees nothing at all. </w:t>
             </w:r>
             <w:r>
@@ -1632,16 +1690,52 @@
           </w:p>
           <w:p>
             <w:pPr>
-              <w:spacing w:after="0" w:before="0" w:line="276"/>
-            </w:pPr>
-            <w:r>
-              <w:rPr>
-                <w:rFonts w:ascii="Calibri" w:cs="Calibri" w:eastAsia="Calibri" w:hAnsi="Calibri"/>
-                <w:color w:val="1B2220"/>
-                <w:sz w:val="21"/>
-                <w:szCs w:val="21"/>
-              </w:rPr>
-              <w:t xml:space="preserve">If no project is open when they press Save, they are asked to open one first. A download remains the fallback if they decline.</w:t>
+              <w:spacing w:after="80" w:before="0" w:line="276"/>
+            </w:pPr>
+            <w:r>
+              <w:rPr>
+                <w:rFonts w:ascii="Calibri" w:cs="Calibri" w:eastAsia="Calibri" w:hAnsi="Calibri"/>
+                <w:b/>
+                <w:bCs/>
+                <w:color w:val="1B2220"/>
+                <w:sz w:val="21"/>
+                <w:szCs w:val="21"/>
+              </w:rPr>
+              <w:t xml:space="preserve">The request only appears once a project is open, </w:t>
+            </w:r>
+            <w:r>
+              <w:rPr>
+                <w:rFonts w:ascii="Calibri" w:cs="Calibri" w:eastAsia="Calibri" w:hAnsi="Calibri"/>
+                <w:color w:val="1B2220"/>
+                <w:sz w:val="21"/>
+                <w:szCs w:val="21"/>
+              </w:rPr>
+              <w:t xml:space="preserve">so saving is a single click into a folder the app already holds. Asking someone to pick a project purely so a file could be written was worse than it sounds: with the move armed they would then be carried across seconds later, and the first thing the new address does is ask them to open that same project again — the same folder picked twice, the app loading twice, inside about ten seconds (Ken, 18 Aug 2026). Reopening after a move is unavoidable; making someone open a project first was not.</w:t>
+            </w:r>
+          </w:p>
+          <w:p>
+            <w:pPr>
+              <w:spacing w:after="0" w:before="0" w:line="276"/>
+            </w:pPr>
+            <w:r>
+              <w:rPr>
+                <w:rFonts w:ascii="Calibri" w:cs="Calibri" w:eastAsia="Calibri" w:hAnsi="Calibri"/>
+                <w:b/>
+                <w:bCs/>
+                <w:color w:val="1B2220"/>
+                <w:sz w:val="21"/>
+                <w:szCs w:val="21"/>
+              </w:rPr>
+              <w:t xml:space="preserve">Consequence, accepted: </w:t>
+            </w:r>
+            <w:r>
+              <w:rPr>
+                <w:rFonts w:ascii="Calibri" w:cs="Calibri" w:eastAsia="Calibri" w:hAnsi="Calibri"/>
+                <w:color w:val="1B2220"/>
+                <w:sz w:val="21"/>
+                <w:szCs w:val="21"/>
+              </w:rPr>
+              <w:t xml:space="preserve">someone who never opens a project is never asked, and never moved. The “We’ve moved” page in step 7 is the backstop for them.</w:t>
             </w:r>
           </w:p>
         </w:tc>

</xml_diff>